<commit_message>
test(stage): record production page and file regressions
</commit_message>
<xml_diff>
--- a/docs/stage-20260908/C/evidence/nested.docx
+++ b/docs/stage-20260908/C/evidence/nested.docx
@@ -13,7 +13,7 @@
           <w:rFonts w:ascii="Times New Roman" w:hAnsi="Times New Roman" w:eastAsia="SimSun"/>
           <w:b/>
         </w:rPr>
-        <w:t>SYN-NEST-1788845239512</w:t>
+        <w:t>SYN-NEST-1788847636288</w:t>
       </w:r>
     </w:p>
     <w:p>
@@ -27,7 +27,7 @@
           <w:rFonts w:ascii="Times New Roman" w:hAnsi="Times New Roman" w:eastAsia="Microsoft YaHei"/>
           <w:b/>
         </w:rPr>
-        <w:t>Synthetic nested size 1788845239512</w:t>
+        <w:t>Synthetic nested size 1788847636288</w:t>
       </w:r>
     </w:p>
     <w:tbl>
@@ -105,7 +105,7 @@
               <w:rPr>
                 <w:rFonts w:ascii="Times New Roman" w:hAnsi="Times New Roman" w:eastAsia="SimSun"/>
               </w:rPr>
-              <w:t>SYN-NEST-1788845239512 Synthetic nested size 1788845239512</w:t>
+              <w:t>SYN-NEST-1788847636288 Synthetic nested size 1788847636288</w:t>
             </w:r>
           </w:p>
         </w:tc>
@@ -1555,7 +1555,7 @@
         <w:sz w:val="16"/>
         <w:szCs w:val="16"/>
       </w:rPr>
-      <w:t>SYN-NEST-1788845239512 | Synthetic nested size 1788845239512</w:t>
+      <w:t>SYN-NEST-1788847636288 | Synthetic nested size 1788847636288</w:t>
     </w:r>
     <w:r>
       <w:tab/>

</xml_diff>

<commit_message>
docs(stage): publish unified acceptance and reproducible evidence
</commit_message>
<xml_diff>
--- a/docs/stage-20260908/C/evidence/nested.docx
+++ b/docs/stage-20260908/C/evidence/nested.docx
@@ -13,7 +13,7 @@
           <w:rFonts w:ascii="Times New Roman" w:hAnsi="Times New Roman" w:eastAsia="SimSun"/>
           <w:b/>
         </w:rPr>
-        <w:t>SYN-NEST-1788847636288</w:t>
+        <w:t>SYN-NEST-1788848009190</w:t>
       </w:r>
     </w:p>
     <w:p>
@@ -27,7 +27,7 @@
           <w:rFonts w:ascii="Times New Roman" w:hAnsi="Times New Roman" w:eastAsia="Microsoft YaHei"/>
           <w:b/>
         </w:rPr>
-        <w:t>Synthetic nested size 1788847636288</w:t>
+        <w:t>Synthetic nested size 1788848009190</w:t>
       </w:r>
     </w:p>
     <w:tbl>
@@ -105,7 +105,7 @@
               <w:rPr>
                 <w:rFonts w:ascii="Times New Roman" w:hAnsi="Times New Roman" w:eastAsia="SimSun"/>
               </w:rPr>
-              <w:t>SYN-NEST-1788847636288 Synthetic nested size 1788847636288</w:t>
+              <w:t>SYN-NEST-1788848009190 Synthetic nested size 1788848009190</w:t>
             </w:r>
           </w:p>
         </w:tc>
@@ -1555,7 +1555,7 @@
         <w:sz w:val="16"/>
         <w:szCs w:val="16"/>
       </w:rPr>
-      <w:t>SYN-NEST-1788847636288 | Synthetic nested size 1788847636288</w:t>
+      <w:t>SYN-NEST-1788848009190 | Synthetic nested size 1788848009190</w:t>
     </w:r>
     <w:r>
       <w:tab/>

</xml_diff>

<commit_message>
docs(editor): attach successful production formatting and image evidence
</commit_message>
<xml_diff>
--- a/docs/stage-20260908/C/evidence/nested.docx
+++ b/docs/stage-20260908/C/evidence/nested.docx
@@ -13,7 +13,7 @@
           <w:rFonts w:ascii="Times New Roman" w:hAnsi="Times New Roman" w:eastAsia="SimSun"/>
           <w:b/>
         </w:rPr>
-        <w:t>SYN-NEST-1788845239512</w:t>
+        <w:t>SYN-NEST-1788848009190</w:t>
       </w:r>
     </w:p>
     <w:p>
@@ -27,7 +27,7 @@
           <w:rFonts w:ascii="Times New Roman" w:hAnsi="Times New Roman" w:eastAsia="Microsoft YaHei"/>
           <w:b/>
         </w:rPr>
-        <w:t>Synthetic nested size 1788845239512</w:t>
+        <w:t>Synthetic nested size 1788848009190</w:t>
       </w:r>
     </w:p>
     <w:tbl>
@@ -105,7 +105,7 @@
               <w:rPr>
                 <w:rFonts w:ascii="Times New Roman" w:hAnsi="Times New Roman" w:eastAsia="SimSun"/>
               </w:rPr>
-              <w:t>SYN-NEST-1788845239512 Synthetic nested size 1788845239512</w:t>
+              <w:t>SYN-NEST-1788848009190 Synthetic nested size 1788848009190</w:t>
             </w:r>
           </w:p>
         </w:tc>
@@ -1555,7 +1555,7 @@
         <w:sz w:val="16"/>
         <w:szCs w:val="16"/>
       </w:rPr>
-      <w:t>SYN-NEST-1788845239512 | Synthetic nested size 1788845239512</w:t>
+      <w:t>SYN-NEST-1788848009190 | Synthetic nested size 1788848009190</w:t>
     </w:r>
     <w:r>
       <w:tab/>

</xml_diff>